<commit_message>
Cart drawer: drop 'ongoing' from the saving line
Co-Authored-By: Claude Opus 5.5 <noreply@anthropic.com>
Claude-Session: https://claude.ai/code/session_01VYMABjkorQn2QmgJS9ckGR
</commit_message>
<xml_diff>
--- a/handoff/MUTO_Dev_Handoff_BF_PDP_30Oct2026.docx
+++ b/handoff/MUTO_Dev_Handoff_BF_PDP_30Oct2026.docx
@@ -5516,7 +5516,7 @@
         <w:t xml:space="preserve">”</w:t>
       </w:r>
       <w:r>
-        <w:t xml:space="preserve">. The main product keeps</w:t>
+        <w:t xml:space="preserve">. The main product says</w:t>
       </w:r>
       <w:r>
         <w:t xml:space="preserve"> </w:t>
@@ -5525,13 +5525,31 @@
         <w:t xml:space="preserve">“</w:t>
       </w:r>
       <w:r>
-        <w:t xml:space="preserve">every 3 months, ongoing</w:t>
+        <w:t xml:space="preserve">You save £60 every 3 months</w:t>
       </w:r>
       <w:r>
         <w:t xml:space="preserve">”</w:t>
       </w:r>
       <w:r>
-        <w:t xml:space="preserve">. If you’ve edited the drawer since 27 Oct, copy the change across instead. It’s the</w:t>
+        <w:t xml:space="preserve"> </w:t>
+      </w:r>
+      <w:r>
+        <w:t xml:space="preserve">(</w:t>
+      </w:r>
+      <w:r>
+        <w:t xml:space="preserve">“</w:t>
+      </w:r>
+      <w:r>
+        <w:t xml:space="preserve">ongoing</w:t>
+      </w:r>
+      <w:r>
+        <w:t xml:space="preserve">”</w:t>
+      </w:r>
+      <w:r>
+        <w:t xml:space="preserve"> </w:t>
+      </w:r>
+      <w:r>
+        <w:t xml:space="preserve">removed). If you’ve edited the drawer since 27 Oct, copy the change across instead. It’s the</w:t>
       </w:r>
       <w:r>
         <w:t xml:space="preserve"> </w:t>

</xml_diff>

<commit_message>
Cart subtotal: anchor on the product (£210 → £99, save £111) and show '+ £87 of free gifts' separately
Co-Authored-By: Claude Opus 5.5 <noreply@anthropic.com>
Claude-Session: https://claude.ai/code/session_01VYMABjkorQn2QmgJS9ckGR
</commit_message>
<xml_diff>
--- a/handoff/MUTO_Dev_Handoff_BF_PDP_30Oct2026.docx
+++ b/handoff/MUTO_Dev_Handoff_BF_PDP_30Oct2026.docx
@@ -511,7 +511,7 @@
               <w:jc w:val="left"/>
             </w:pPr>
             <w:r>
-              <w:t xml:space="preserve">Two changes: the BF product’s saving reads</w:t>
+              <w:t xml:space="preserve">The BF product’s saving reads</w:t>
             </w:r>
             <w:r>
               <w:t xml:space="preserve"> </w:t>
@@ -526,7 +526,61 @@
               <w:t xml:space="preserve">”</w:t>
             </w:r>
             <w:r>
-              <w:t xml:space="preserve">, and the travel vial sorts with the bottle</w:t>
+              <w:t xml:space="preserve"> </w:t>
+            </w:r>
+            <w:r>
+              <w:t xml:space="preserve">(no</w:t>
+            </w:r>
+            <w:r>
+              <w:t xml:space="preserve"> </w:t>
+            </w:r>
+            <w:r>
+              <w:t xml:space="preserve">“</w:t>
+            </w:r>
+            <w:r>
+              <w:t xml:space="preserve">ongoing</w:t>
+            </w:r>
+            <w:r>
+              <w:t xml:space="preserve">”</w:t>
+            </w:r>
+            <w:r>
+              <w:t xml:space="preserve"> </w:t>
+            </w:r>
+            <w:r>
+              <w:t xml:space="preserve">anywhere). The travel vial sorts with the bottle. The subtotal is anchored on the product’s compare-at,</w:t>
+            </w:r>
+            <w:r>
+              <w:t xml:space="preserve"> </w:t>
+            </w:r>
+            <w:r>
+              <w:rPr>
+                <w:strike/>
+              </w:rPr>
+              <w:t xml:space="preserve">£210</w:t>
+            </w:r>
+            <w:r>
+              <w:t xml:space="preserve"> </w:t>
+            </w:r>
+            <w:r>
+              <w:t xml:space="preserve">£99 · Save £111, with</w:t>
+            </w:r>
+            <w:r>
+              <w:t xml:space="preserve"> </w:t>
+            </w:r>
+            <w:r>
+              <w:t xml:space="preserve">“</w:t>
+            </w:r>
+            <w:r>
+              <w:t xml:space="preserve">+ £87 of free gifts</w:t>
+            </w:r>
+            <w:r>
+              <w:t xml:space="preserve">”</w:t>
+            </w:r>
+            <w:r>
+              <w:t xml:space="preserve"> </w:t>
+            </w:r>
+            <w:r>
+              <w:t xml:space="preserve">in a lime pill underneath, where the gifts used to be added into the crossed-out total</w:t>
             </w:r>
           </w:p>
         </w:tc>

</xml_diff>